<commit_message>
Update to the final report with KS Statistics and SHAP
</commit_message>
<xml_diff>
--- a/reports/Accounting Fraud Detection Project Report.docx
+++ b/reports/Accounting Fraud Detection Project Report.docx
@@ -22,8 +22,13 @@
         <w:pStyle w:val="Subtitle"/>
         <w:jc w:val="center"/>
       </w:pPr>
-      <w:r>
-        <w:t>By: Bini Teklehaimanot</w:t>
+      <w:proofErr w:type="gramStart"/>
+      <w:r>
+        <w:t>By</w:t>
+      </w:r>
+      <w:proofErr w:type="gramEnd"/>
+      <w:r>
+        <w:t>: Bini Teklehaimanot</w:t>
       </w:r>
     </w:p>
     <w:p/>
@@ -260,6 +265,7 @@
       <w:r>
         <w:rPr>
           <w:rFonts w:ascii="Times New Roman" w:eastAsia="Times New Roman" w:hAnsi="Times New Roman" w:cs="Times New Roman"/>
+          <w:noProof/>
           <w:kern w:val="0"/>
           <w:sz w:val="24"/>
           <w:szCs w:val="24"/>
@@ -388,6 +394,7 @@
         </w:rPr>
         <w:t xml:space="preserve"> and </w:t>
       </w:r>
+      <w:proofErr w:type="gramStart"/>
       <w:r>
         <w:rPr>
           <w:rFonts w:ascii="Courier New" w:eastAsia="Times New Roman" w:hAnsi="Courier New" w:cs="Courier New"/>
@@ -398,6 +405,7 @@
         </w:rPr>
         <w:t>dpi</w:t>
       </w:r>
+      <w:proofErr w:type="gramEnd"/>
       <w:r>
         <w:rPr>
           <w:rFonts w:ascii="Times New Roman" w:eastAsia="Times New Roman" w:hAnsi="Times New Roman" w:cs="Times New Roman"/>
@@ -490,6 +498,9 @@
     </w:p>
     <w:p>
       <w:r>
+        <w:rPr>
+          <w:noProof/>
+        </w:rPr>
         <w:lastRenderedPageBreak/>
         <w:drawing>
           <wp:inline distT="0" distB="0" distL="0" distR="0" wp14:anchorId="60FE81C2" wp14:editId="2A502A87">
@@ -543,11 +554,22 @@
     </w:p>
     <w:p>
       <w:r>
-        <w:t>To better understand class-specific behavior, we also visualized the distribution of key engineered features—such as the book-to-market ratio (bm)—separated by fraud label. The histogram below shows a clear difference in the density curve of bm between misstated and non-misstated cases. While overlapping exists, this kind of separation in distributions guided the modeling effort by emphasizing which features showed class-discriminative power.</w:t>
-      </w:r>
-    </w:p>
-    <w:p>
-      <w:r>
+        <w:t>To better understand class-specific behavior, we also visualized the distribution of key engineered features—such as the book-to-market ratio (</w:t>
+      </w:r>
+      <w:proofErr w:type="gramStart"/>
+      <w:r>
+        <w:t>bm)—</w:t>
+      </w:r>
+      <w:proofErr w:type="gramEnd"/>
+      <w:r>
+        <w:t>separated by fraud label. The histogram below shows a clear difference in the density curve of bm between misstated and non-misstated cases. While overlapping exists, this kind of separation in distributions guided the modeling effort by emphasizing which features showed class-discriminative power.</w:t>
+      </w:r>
+    </w:p>
+    <w:p>
+      <w:r>
+        <w:rPr>
+          <w:noProof/>
+        </w:rPr>
         <w:lastRenderedPageBreak/>
         <w:drawing>
           <wp:inline distT="0" distB="0" distL="0" distR="0" wp14:anchorId="2D61FF92" wp14:editId="723650BC">
@@ -588,7 +610,15 @@
     </w:p>
     <w:p>
       <w:r>
-        <w:t>These findings laid the foundation for feature selection and informed downstream modeling decisions—including how to handle class imbalance and which transformations to apply for better model interpretability.</w:t>
+        <w:t xml:space="preserve">These findings laid the foundation for feature selection and informed downstream modeling </w:t>
+      </w:r>
+      <w:proofErr w:type="gramStart"/>
+      <w:r>
+        <w:t>decisions—</w:t>
+      </w:r>
+      <w:proofErr w:type="gramEnd"/>
+      <w:r>
+        <w:t>including how to handle class imbalance and which transformations to apply for better model interpretability.</w:t>
       </w:r>
     </w:p>
     <w:p>
@@ -606,7 +636,31 @@
     </w:p>
     <w:p>
       <w:r>
-        <w:t>During exploratory data analysis, several features exhibited extreme values and long-tailed distributions. These outliers were not removed or capped. Given that the dataset represents publicly traded U.S. companies spanning a wide spectrum of industries, sizes, and reporting practices, such variation is expected. Excluding these values could suppress meaningful signals from large-cap firms or those with atypical financial profiles—both of which are critical to the integrity of fraud detection modeling. Preserving the full distribution ensures that the model reflects the diversity and complexity inherent in real-world financial reporting.</w:t>
+        <w:t xml:space="preserve">During </w:t>
+      </w:r>
+      <w:proofErr w:type="gramStart"/>
+      <w:r>
+        <w:t>exploratory</w:t>
+      </w:r>
+      <w:proofErr w:type="gramEnd"/>
+      <w:r>
+        <w:t xml:space="preserve"> data analysis, several features exhibited extreme values and long-tailed distributions. These outliers were not removed or capped. Given that the dataset represents publicly traded U.S. companies spanning a wide spectrum of industries, sizes, and reporting practices, such variation is expected. Excluding these values could suppress meaningful signals from large-cap firms or those with atypical financial </w:t>
+      </w:r>
+      <w:proofErr w:type="gramStart"/>
+      <w:r>
+        <w:t>profiles—</w:t>
+      </w:r>
+      <w:proofErr w:type="gramEnd"/>
+      <w:r>
+        <w:t xml:space="preserve">both of which are critical to the integrity of fraud detection modeling. Preserving </w:t>
+      </w:r>
+      <w:proofErr w:type="gramStart"/>
+      <w:r>
+        <w:t>the full</w:t>
+      </w:r>
+      <w:proofErr w:type="gramEnd"/>
+      <w:r>
+        <w:t xml:space="preserve"> distribution ensures that the model reflects the diversity and complexity inherent in real-world financial reporting.</w:t>
       </w:r>
     </w:p>
     <w:p>
@@ -624,6 +678,7 @@
     </w:p>
     <w:p>
       <w:r>
+        <w:lastRenderedPageBreak/>
         <w:t xml:space="preserve">To improve model interpretability and performance, we applied a mixed-scaler </w:t>
       </w:r>
       <w:proofErr w:type="spellStart"/>
@@ -661,11 +716,7 @@
       </w:r>
       <w:proofErr w:type="spellEnd"/>
       <w:r>
-        <w:t xml:space="preserve"> built-in feature ranking, we identified the top variables driving predictions. The plot below shows the top 20 features, </w:t>
-      </w:r>
-      <w:r>
-        <w:lastRenderedPageBreak/>
-        <w:t>highlighting attributes like operating cash flow ratio (</w:t>
+        <w:t xml:space="preserve"> built-in feature ranking, we identified the top variables driving predictions. The plot below shows the top 20 features, highlighting attributes like operating cash flow ratio (</w:t>
       </w:r>
       <w:proofErr w:type="spellStart"/>
       <w:r>
@@ -732,6 +783,9 @@
         <w:br/>
       </w:r>
       <w:r>
+        <w:rPr>
+          <w:noProof/>
+        </w:rPr>
         <w:drawing>
           <wp:inline distT="0" distB="0" distL="0" distR="0" wp14:anchorId="293ECB8F" wp14:editId="4B2056A8">
             <wp:extent cx="4332080" cy="2458085"/>
@@ -826,9 +880,13 @@
         <w:jc w:val="center"/>
       </w:pPr>
       <w:r>
+        <w:lastRenderedPageBreak/>
         <w:br/>
       </w:r>
       <w:r>
+        <w:rPr>
+          <w:noProof/>
+        </w:rPr>
         <w:drawing>
           <wp:inline distT="0" distB="0" distL="0" distR="0" wp14:anchorId="41A4D07F" wp14:editId="6B197183">
             <wp:extent cx="3723005" cy="2409825"/>
@@ -882,8 +940,149 @@
     <w:p/>
     <w:p>
       <w:r>
-        <w:lastRenderedPageBreak/>
-        <w:t>These simulations not only validate the model’s directional logic, but also help financial analysts identify leverage points for risk mitigation.</w:t>
+        <w:t xml:space="preserve">These simulations not only validate the model’s directional </w:t>
+      </w:r>
+      <w:proofErr w:type="gramStart"/>
+      <w:r>
+        <w:t>logic, but</w:t>
+      </w:r>
+      <w:proofErr w:type="gramEnd"/>
+      <w:r>
+        <w:t xml:space="preserve"> also help financial analysts identify leverage points for risk mitigation.</w:t>
+      </w:r>
+    </w:p>
+    <w:p>
+      <w:r>
+        <w:rPr>
+          <w:rFonts w:ascii="Segoe UI Emoji" w:hAnsi="Segoe UI Emoji" w:cs="Segoe UI Emoji"/>
+          <w:b/>
+          <w:bCs/>
+        </w:rPr>
+        <w:t>📉</w:t>
+      </w:r>
+      <w:r>
+        <w:rPr>
+          <w:b/>
+          <w:bCs/>
+        </w:rPr>
+        <w:t xml:space="preserve"> KS-Based Decision Support for Business Constraints</w:t>
+      </w:r>
+    </w:p>
+    <w:p>
+      <w:r>
+        <w:t xml:space="preserve">To support real-world constraints (e.g., resource-limited audits), we computed precision at various </w:t>
+      </w:r>
+      <w:proofErr w:type="gramStart"/>
+      <w:r>
+        <w:t>top-N</w:t>
+      </w:r>
+      <w:proofErr w:type="gramEnd"/>
+      <w:r>
+        <w:t xml:space="preserve"> cutoffs using </w:t>
+      </w:r>
+      <w:r>
+        <w:rPr>
+          <w:b/>
+          <w:bCs/>
+        </w:rPr>
+        <w:t>KS (Kolmogorov–Smirnov) statistics</w:t>
+      </w:r>
+      <w:r>
+        <w:t xml:space="preserve"> and model confidence scores. This approach allows audit teams to focus on a customizable number of high-risk filings.</w:t>
+      </w:r>
+    </w:p>
+    <w:p>
+      <w:r>
+        <w:t>For example:</w:t>
+      </w:r>
+    </w:p>
+    <w:p>
+      <w:pPr>
+        <w:numPr>
+          <w:ilvl w:val="0"/>
+          <w:numId w:val="14"/>
+        </w:numPr>
+      </w:pPr>
+      <w:r>
+        <w:rPr>
+          <w:b/>
+          <w:bCs/>
+        </w:rPr>
+        <w:t>Top 1,000 records</w:t>
+      </w:r>
+      <w:r>
+        <w:t xml:space="preserve"> → </w:t>
+      </w:r>
+      <w:r>
+        <w:rPr>
+          <w:b/>
+          <w:bCs/>
+        </w:rPr>
+        <w:t>Precision = 7.9%</w:t>
+      </w:r>
+      <w:r>
+        <w:t>, Cutoff = 0.1555</w:t>
+      </w:r>
+    </w:p>
+    <w:p>
+      <w:pPr>
+        <w:numPr>
+          <w:ilvl w:val="0"/>
+          <w:numId w:val="14"/>
+        </w:numPr>
+      </w:pPr>
+      <w:r>
+        <w:rPr>
+          <w:b/>
+          <w:bCs/>
+        </w:rPr>
+        <w:t>Top 3,000 records</w:t>
+      </w:r>
+      <w:r>
+        <w:t xml:space="preserve"> → </w:t>
+      </w:r>
+      <w:r>
+        <w:rPr>
+          <w:b/>
+          <w:bCs/>
+        </w:rPr>
+        <w:t>Precision = 3.7%</w:t>
+      </w:r>
+      <w:r>
+        <w:t>, Cutoff = 0.1223</w:t>
+      </w:r>
+    </w:p>
+    <w:p>
+      <w:pPr>
+        <w:numPr>
+          <w:ilvl w:val="0"/>
+          <w:numId w:val="14"/>
+        </w:numPr>
+      </w:pPr>
+      <w:r>
+        <w:rPr>
+          <w:b/>
+          <w:bCs/>
+        </w:rPr>
+        <w:t>Top 5,000 records</w:t>
+      </w:r>
+      <w:r>
+        <w:t xml:space="preserve"> → </w:t>
+      </w:r>
+      <w:r>
+        <w:rPr>
+          <w:b/>
+          <w:bCs/>
+        </w:rPr>
+        <w:t>Precision = 2.5%</w:t>
+      </w:r>
+      <w:r>
+        <w:t>, Cutoff = 0.0763</w:t>
+      </w:r>
+    </w:p>
+    <w:p>
+      <w:r>
+        <w:t>This enables flexible prioritization based on team capacity—supporting risk triage workflows and transparent trade-offs between coverage and depth.</w:t>
       </w:r>
     </w:p>
     <w:p/>
@@ -1013,6 +1212,7 @@
           <w:b/>
           <w:bCs/>
         </w:rPr>
+        <w:lastRenderedPageBreak/>
         <w:t>Change in Working Capital</w:t>
       </w:r>
     </w:p>
@@ -1068,7 +1268,15 @@
     </w:p>
     <w:p>
       <w:r>
-        <w:t xml:space="preserve">Importantly, the DNN model alone was less responsive to class imbalance, but when blended with </w:t>
+        <w:t xml:space="preserve">Importantly, the DNN model alone was less responsive to class imbalance, but </w:t>
+      </w:r>
+      <w:proofErr w:type="gramStart"/>
+      <w:r>
+        <w:t>when</w:t>
+      </w:r>
+      <w:proofErr w:type="gramEnd"/>
+      <w:r>
+        <w:t xml:space="preserve"> blended with </w:t>
       </w:r>
       <w:proofErr w:type="spellStart"/>
       <w:r>
@@ -1116,7 +1324,6 @@
     </w:p>
     <w:p>
       <w:r>
-        <w:lastRenderedPageBreak/>
         <w:t>Key strategic applications include:</w:t>
       </w:r>
     </w:p>
@@ -1153,7 +1360,15 @@
         <w:t>Risk-Based Audit Planning</w:t>
       </w:r>
       <w:r>
-        <w:t>: Enhance audit strategies by identifying specific accounts—such as retained earnings or payables—where risk is elevated.</w:t>
+        <w:t xml:space="preserve">: Enhance audit strategies by identifying specific accounts—such as retained earnings or </w:t>
+      </w:r>
+      <w:proofErr w:type="gramStart"/>
+      <w:r>
+        <w:t>payables—</w:t>
+      </w:r>
+      <w:proofErr w:type="gramEnd"/>
+      <w:r>
+        <w:t>where risk is elevated.</w:t>
       </w:r>
     </w:p>
     <w:p>
@@ -1204,6 +1419,7 @@
           <w:b/>
           <w:bCs/>
         </w:rPr>
+        <w:lastRenderedPageBreak/>
         <w:t>🛡️</w:t>
       </w:r>
       <w:r>
@@ -1316,35 +1532,43 @@
       </w:r>
       <w:r>
         <w:br/>
-        <w:t>Establish a near real-time monitoring system where financial statements are automatically scored against the fraud risk model during reporting cycles, creating a closed-loop alerting mechanism.</w:t>
+        <w:t xml:space="preserve">Establish a near real-time monitoring system where financial statements are automatically scored against the fraud risk model during reporting cycles, creating a </w:t>
+      </w:r>
+      <w:proofErr w:type="gramStart"/>
+      <w:r>
+        <w:t>closed-loop</w:t>
+      </w:r>
+      <w:proofErr w:type="gramEnd"/>
+      <w:r>
+        <w:t xml:space="preserve"> alerting mechanism.</w:t>
+      </w:r>
+    </w:p>
+    <w:p>
+      <w:r>
+        <w:t>Incorporating machine learning into governance practices doesn't replace human judgment—it enhances it. This model empowers compliance leaders to shift from reactive detection to proactive prevention, elevating the strategic role of internal controls in enterprise risk frameworks.</w:t>
+      </w:r>
+    </w:p>
+    <w:p/>
+    <w:p>
+      <w:r>
+        <w:rPr>
+          <w:rFonts w:ascii="Segoe UI Emoji" w:hAnsi="Segoe UI Emoji" w:cs="Segoe UI Emoji"/>
+          <w:b/>
+          <w:bCs/>
+        </w:rPr>
+        <w:t>🔮</w:t>
+      </w:r>
+      <w:r>
+        <w:rPr>
+          <w:b/>
+          <w:bCs/>
+        </w:rPr>
+        <w:t xml:space="preserve"> Future Improvements: Which Scenarios Should Be Studied Further?</w:t>
       </w:r>
     </w:p>
     <w:p>
       <w:r>
         <w:lastRenderedPageBreak/>
-        <w:t>Incorporating machine learning into governance practices doesn't replace human judgment—it enhances it. This model empowers compliance leaders to shift from reactive detection to proactive prevention, elevating the strategic role of internal controls in enterprise risk frameworks.</w:t>
-      </w:r>
-    </w:p>
-    <w:p/>
-    <w:p>
-      <w:r>
-        <w:rPr>
-          <w:rFonts w:ascii="Segoe UI Emoji" w:hAnsi="Segoe UI Emoji" w:cs="Segoe UI Emoji"/>
-          <w:b/>
-          <w:bCs/>
-        </w:rPr>
-        <w:t>🔮</w:t>
-      </w:r>
-      <w:r>
-        <w:rPr>
-          <w:b/>
-          <w:bCs/>
-        </w:rPr>
-        <w:t xml:space="preserve"> Future Improvements: Which Scenarios Should Be Studied Further?</w:t>
-      </w:r>
-    </w:p>
-    <w:p>
-      <w:r>
         <w:t>While the current framework demonstrates strong predictive power, several avenues exist for expanding its scope and impact:</w:t>
       </w:r>
     </w:p>
@@ -1407,6 +1631,56 @@
     </w:p>
     <w:p>
       <w:pPr>
+        <w:ind w:left="720"/>
+        <w:rPr>
+          <w:b/>
+          <w:bCs/>
+        </w:rPr>
+      </w:pPr>
+    </w:p>
+    <w:p>
+      <w:pPr>
+        <w:ind w:left="720"/>
+        <w:rPr>
+          <w:b/>
+          <w:bCs/>
+        </w:rPr>
+      </w:pPr>
+    </w:p>
+    <w:p>
+      <w:pPr>
+        <w:ind w:left="720"/>
+        <w:rPr>
+          <w:b/>
+          <w:bCs/>
+        </w:rPr>
+      </w:pPr>
+    </w:p>
+    <w:p>
+      <w:pPr>
+        <w:ind w:left="720"/>
+        <w:rPr>
+          <w:b/>
+          <w:bCs/>
+        </w:rPr>
+      </w:pPr>
+    </w:p>
+    <w:p>
+      <w:pPr>
+        <w:ind w:left="720"/>
+        <w:rPr>
+          <w:b/>
+          <w:bCs/>
+        </w:rPr>
+      </w:pPr>
+    </w:p>
+    <w:p>
+      <w:pPr>
+        <w:ind w:left="720"/>
+      </w:pPr>
+    </w:p>
+    <w:p>
+      <w:pPr>
         <w:numPr>
           <w:ilvl w:val="0"/>
           <w:numId w:val="8"/>
@@ -1417,27 +1691,191 @@
           <w:b/>
           <w:bCs/>
         </w:rPr>
+        <w:t xml:space="preserve">SHAP-Based </w:t>
+      </w:r>
+      <w:r>
+        <w:rPr>
+          <w:b/>
+          <w:bCs/>
+        </w:rPr>
         <w:t>Explainability Enhancements</w:t>
       </w:r>
+    </w:p>
+    <w:p>
+      <w:pPr>
+        <w:ind w:left="720"/>
+        <w:jc w:val="center"/>
+      </w:pPr>
       <w:r>
         <w:br/>
-        <w:t>Integrating SHAP (</w:t>
+      </w:r>
+      <w:r>
+        <w:drawing>
+          <wp:inline distT="0" distB="0" distL="0" distR="0" wp14:anchorId="6D0F542B" wp14:editId="001CE33F">
+            <wp:extent cx="1864459" cy="2179983"/>
+            <wp:effectExtent l="0" t="0" r="2540" b="0"/>
+            <wp:docPr id="1065021177" name="Picture 1" descr="A graph of a number&#10;&#10;AI-generated content may be incorrect."/>
+            <wp:cNvGraphicFramePr>
+              <a:graphicFrameLocks xmlns:a="http://schemas.openxmlformats.org/drawingml/2006/main" noChangeAspect="1"/>
+            </wp:cNvGraphicFramePr>
+            <a:graphic xmlns:a="http://schemas.openxmlformats.org/drawingml/2006/main">
+              <a:graphicData uri="http://schemas.openxmlformats.org/drawingml/2006/picture">
+                <pic:pic xmlns:pic="http://schemas.openxmlformats.org/drawingml/2006/picture">
+                  <pic:nvPicPr>
+                    <pic:cNvPr id="1065021177" name="Picture 1" descr="A graph of a number&#10;&#10;AI-generated content may be incorrect."/>
+                    <pic:cNvPicPr/>
+                  </pic:nvPicPr>
+                  <pic:blipFill>
+                    <a:blip r:embed="rId11"/>
+                    <a:stretch>
+                      <a:fillRect/>
+                    </a:stretch>
+                  </pic:blipFill>
+                  <pic:spPr>
+                    <a:xfrm>
+                      <a:off x="0" y="0"/>
+                      <a:ext cx="1870490" cy="2187035"/>
+                    </a:xfrm>
+                    <a:prstGeom prst="rect">
+                      <a:avLst/>
+                    </a:prstGeom>
+                  </pic:spPr>
+                </pic:pic>
+              </a:graphicData>
+            </a:graphic>
+          </wp:inline>
+        </w:drawing>
+      </w:r>
+    </w:p>
+    <w:p>
+      <w:pPr>
+        <w:ind w:left="720"/>
+      </w:pPr>
+      <w:r>
+        <w:t xml:space="preserve">To enhance model transparency and stakeholder trust, we implemented </w:t>
+      </w:r>
+      <w:r>
+        <w:rPr>
+          <w:b/>
+          <w:bCs/>
+        </w:rPr>
+        <w:t>SHAP (</w:t>
       </w:r>
       <w:proofErr w:type="spellStart"/>
       <w:r>
+        <w:rPr>
+          <w:b/>
+          <w:bCs/>
+        </w:rPr>
         <w:t>SHapley</w:t>
       </w:r>
       <w:proofErr w:type="spellEnd"/>
       <w:r>
+        <w:rPr>
+          <w:b/>
+          <w:bCs/>
+        </w:rPr>
         <w:t xml:space="preserve"> Additive </w:t>
       </w:r>
       <w:proofErr w:type="spellStart"/>
-      <w:r>
+      <w:proofErr w:type="gramStart"/>
+      <w:r>
+        <w:rPr>
+          <w:b/>
+          <w:bCs/>
+        </w:rPr>
         <w:t>exPlanations</w:t>
       </w:r>
       <w:proofErr w:type="spellEnd"/>
-      <w:r>
-        <w:t>) or LIME could make the DNN component more interpretable, offering clearer justification for flagged risks—critical for adoption by compliance and audit professionals.</w:t>
+      <w:proofErr w:type="gramEnd"/>
+      <w:r>
+        <w:rPr>
+          <w:b/>
+          <w:bCs/>
+        </w:rPr>
+        <w:t>)</w:t>
+      </w:r>
+      <w:r>
+        <w:t xml:space="preserve"> for our </w:t>
+      </w:r>
+      <w:proofErr w:type="spellStart"/>
+      <w:r>
+        <w:t>CatBoost</w:t>
+      </w:r>
+      <w:proofErr w:type="spellEnd"/>
+      <w:r>
+        <w:t xml:space="preserve"> model. This provides both global and local interpretability:</w:t>
+      </w:r>
+    </w:p>
+    <w:p>
+      <w:pPr>
+        <w:numPr>
+          <w:ilvl w:val="1"/>
+          <w:numId w:val="8"/>
+        </w:numPr>
+      </w:pPr>
+      <w:r>
+        <w:rPr>
+          <w:b/>
+          <w:bCs/>
+        </w:rPr>
+        <w:t>Global Insights</w:t>
+      </w:r>
+      <w:r>
+        <w:t xml:space="preserve">: The SHAP bar plot confirms top drivers (e.g., </w:t>
+      </w:r>
+      <w:proofErr w:type="spellStart"/>
+      <w:r>
+        <w:t>ch_cm</w:t>
+      </w:r>
+      <w:proofErr w:type="spellEnd"/>
+      <w:r>
+        <w:t xml:space="preserve">, ap, re), validating </w:t>
+      </w:r>
+      <w:proofErr w:type="spellStart"/>
+      <w:r>
+        <w:t>CatBoost</w:t>
+      </w:r>
+      <w:proofErr w:type="spellEnd"/>
+      <w:r>
+        <w:t xml:space="preserve"> feature importances via a game-theory-based approach.</w:t>
+      </w:r>
+      <w:r>
+        <w:tab/>
+      </w:r>
+    </w:p>
+    <w:p>
+      <w:pPr>
+        <w:numPr>
+          <w:ilvl w:val="1"/>
+          <w:numId w:val="8"/>
+        </w:numPr>
+      </w:pPr>
+      <w:r>
+        <w:rPr>
+          <w:b/>
+          <w:bCs/>
+        </w:rPr>
+        <w:t>Local Explanations</w:t>
+      </w:r>
+      <w:r>
+        <w:t xml:space="preserve">: The </w:t>
+      </w:r>
+      <w:proofErr w:type="spellStart"/>
+      <w:r>
+        <w:t>beeswarm</w:t>
+      </w:r>
+      <w:proofErr w:type="spellEnd"/>
+      <w:r>
+        <w:t xml:space="preserve"> plot reveals how individual features push predictions toward or away from fraud on a per-record basis—enabling analysts to justify each model flag during case reviews.</w:t>
+      </w:r>
+    </w:p>
+    <w:p>
+      <w:pPr>
+        <w:ind w:left="720"/>
+      </w:pPr>
+      <w:r>
+        <w:t>This dual view is critical for audit and compliance teams tasked with explaining and defending model decisions to regulators or executives.</w:t>
       </w:r>
     </w:p>
     <w:p>
@@ -1461,7 +1899,15 @@
     </w:p>
     <w:p>
       <w:r>
-        <w:t>These enhancements would not only improve detection accuracy but also increase stakeholder trust in model outputs. Future iterations could also be deployed as part of automated policy simulations, scenario testing, or fraud scoring APIs accessible across enterprise risk systems.</w:t>
+        <w:t xml:space="preserve">These enhancements would not only improve detection accuracy but also increase stakeholder trust in model </w:t>
+      </w:r>
+      <w:proofErr w:type="gramStart"/>
+      <w:r>
+        <w:t>outputs</w:t>
+      </w:r>
+      <w:proofErr w:type="gramEnd"/>
+      <w:r>
+        <w:t>. Future iterations could also be deployed as part of automated policy simulations, scenario testing, or fraud scoring APIs accessible across enterprise risk systems.</w:t>
       </w:r>
     </w:p>
     <w:p/>
@@ -1470,6 +1916,7 @@
         <w:pStyle w:val="Heading1"/>
       </w:pPr>
       <w:r>
+        <w:lastRenderedPageBreak/>
         <w:t>Conclusion</w:t>
       </w:r>
       <w:r>
@@ -1481,67 +1928,91 @@
     </w:p>
     <w:p>
       <w:r>
-        <w:t xml:space="preserve">This project demonstrates that financial fraud is not only detectable—it is quantifiable through machine learning models grounded in structured accounting data. By combining the interpretability </w:t>
+        <w:t xml:space="preserve">This project demonstrates that financial fraud is not only </w:t>
+      </w:r>
+      <w:proofErr w:type="gramStart"/>
+      <w:r>
+        <w:t>detectable—</w:t>
+      </w:r>
+      <w:proofErr w:type="gramEnd"/>
+      <w:r>
+        <w:t xml:space="preserve">it is quantifiable through machine learning models grounded in structured accounting data. By combining the interpretability of </w:t>
+      </w:r>
+      <w:proofErr w:type="spellStart"/>
+      <w:r>
+        <w:t>CatBoost</w:t>
+      </w:r>
+      <w:proofErr w:type="spellEnd"/>
+      <w:r>
+        <w:t xml:space="preserve"> with the pattern recognition strength of DNNs, we created a hybrid model capable of flagging subtle misstatement patterns with high precision, even under severe class imbalance.</w:t>
+      </w:r>
+    </w:p>
+    <w:p>
+      <w:r>
+        <w:t>Beyond technical success, the framework is designed for operational deployment. It integrates naturally with internal audit workflows, supports SOX compliance, and can guide risk-based decision-making at both tactical and strategic levels. Its modular architecture allows for adaptation to different industries, jurisdictions, or regulatory contexts.</w:t>
+      </w:r>
+    </w:p>
+    <w:p>
+      <w:r>
+        <w:t xml:space="preserve">While the model is already valuable in its current state, future </w:t>
+      </w:r>
+      <w:proofErr w:type="gramStart"/>
+      <w:r>
+        <w:t>work—</w:t>
+      </w:r>
+      <w:proofErr w:type="gramEnd"/>
+      <w:r>
+        <w:t>including integration of textual disclosures, time-</w:t>
+      </w:r>
+      <w:proofErr w:type="gramStart"/>
+      <w:r>
+        <w:t>series behavior</w:t>
+      </w:r>
+      <w:proofErr w:type="gramEnd"/>
+      <w:r>
+        <w:t>, and enhanced explainability—will push it closer to a real-time, enterprise-ready fraud intelligence platform.</w:t>
+      </w:r>
+    </w:p>
+    <w:p>
+      <w:r>
+        <w:t>In an era of increasing regulatory scrutiny and data availability, this approach positions compliance teams, auditors, and financial executives to move from reactive investigation to proactive detection—safeguarding shareholder trust and reinforcing market integrity.</w:t>
+      </w:r>
+    </w:p>
+    <w:p/>
+    <w:p>
+      <w:pPr>
+        <w:pStyle w:val="Heading1"/>
+      </w:pPr>
+      <w:r>
+        <w:t>Future scope of work</w:t>
+      </w:r>
+    </w:p>
+    <w:p>
+      <w:r>
+        <w:rPr>
+          <w:b/>
+          <w:bCs/>
+        </w:rPr>
+        <w:t>Data Limitations &amp; Deficiencies</w:t>
+      </w:r>
+    </w:p>
+    <w:p>
+      <w:r>
+        <w:t>While the model delivered meaningful predictive performance, several limitations in the underlying data warrant caution and highlight areas for refinement.</w:t>
+      </w:r>
+    </w:p>
+    <w:p>
+      <w:r>
+        <w:t>First, the dataset reflects a single fiscal year snapshot (2023), limiting visibility into temporal patterns or year-over-year manipulations that often characterize fraudulent reporting. Without multi-period data, the model cannot detect trends such as earnings smoothing or gradual asset overstatement.</w:t>
+      </w:r>
+    </w:p>
+    <w:p>
+      <w:r>
+        <w:t>Second, the target variable—fraudulent misstatement—is binary and derived from labeled cases. These labels are valuable but may underrepresent the true scope of fraud, especially when unde</w:t>
       </w:r>
       <w:r>
         <w:lastRenderedPageBreak/>
-        <w:t xml:space="preserve">of </w:t>
-      </w:r>
-      <w:proofErr w:type="spellStart"/>
-      <w:r>
-        <w:t>CatBoost</w:t>
-      </w:r>
-      <w:proofErr w:type="spellEnd"/>
-      <w:r>
-        <w:t xml:space="preserve"> with the pattern recognition strength of DNNs, we created a hybrid model capable of flagging subtle misstatement patterns with high precision, even under severe class imbalance.</w:t>
-      </w:r>
-    </w:p>
-    <w:p>
-      <w:r>
-        <w:t>Beyond technical success, the framework is designed for operational deployment. It integrates naturally with internal audit workflows, supports SOX compliance, and can guide risk-based decision-making at both tactical and strategic levels. Its modular architecture allows for adaptation to different industries, jurisdictions, or regulatory contexts.</w:t>
-      </w:r>
-    </w:p>
-    <w:p>
-      <w:r>
-        <w:t>While the model is already valuable in its current state, future work—including integration of textual disclosures, time-series behavior, and enhanced explainability—will push it closer to a real-time, enterprise-ready fraud intelligence platform.</w:t>
-      </w:r>
-    </w:p>
-    <w:p>
-      <w:r>
-        <w:t>In an era of increasing regulatory scrutiny and data availability, this approach positions compliance teams, auditors, and financial executives to move from reactive investigation to proactive detection—safeguarding shareholder trust and reinforcing market integrity.</w:t>
-      </w:r>
-    </w:p>
-    <w:p/>
-    <w:p>
-      <w:pPr>
-        <w:pStyle w:val="Heading1"/>
-      </w:pPr>
-      <w:r>
-        <w:t>Future scope of work</w:t>
-      </w:r>
-    </w:p>
-    <w:p>
-      <w:r>
-        <w:rPr>
-          <w:b/>
-          <w:bCs/>
-        </w:rPr>
-        <w:t>Data Limitations &amp; Deficiencies</w:t>
-      </w:r>
-    </w:p>
-    <w:p>
-      <w:r>
-        <w:t>While the model delivered meaningful predictive performance, several limitations in the underlying data warrant caution and highlight areas for refinement.</w:t>
-      </w:r>
-    </w:p>
-    <w:p>
-      <w:r>
-        <w:t>First, the dataset reflects a single fiscal year snapshot (2023), limiting visibility into temporal patterns or year-over-year manipulations that often characterize fraudulent reporting. Without multi-period data, the model cannot detect trends such as earnings smoothing or gradual asset overstatement.</w:t>
-      </w:r>
-    </w:p>
-    <w:p>
-      <w:r>
-        <w:t xml:space="preserve">Second, the target variable—fraudulent misstatement—is binary and derived from labeled cases. These labels are valuable but may underrepresent the true scope of fraud, especially when undetected or unreported misconduct exists. This introduces a risk of </w:t>
+        <w:t xml:space="preserve">tected or unreported misconduct exists. This introduces a risk of </w:t>
       </w:r>
       <w:r>
         <w:rPr>
@@ -1572,8 +2043,32 @@
     </w:p>
     <w:p>
       <w:r>
-        <w:t>These limitations, while not fatal, underscore the importance of interpreting model results as directional risk signals rather than definitive fraud judgments.</w:t>
-      </w:r>
+        <w:t xml:space="preserve">These limitations, while not fatal, underscore the importance of interpreting </w:t>
+      </w:r>
+      <w:proofErr w:type="gramStart"/>
+      <w:r>
+        <w:t>model results</w:t>
+      </w:r>
+      <w:proofErr w:type="gramEnd"/>
+      <w:r>
+        <w:t xml:space="preserve"> as directional risk signals rather than definitive fraud judgments.</w:t>
+      </w:r>
+    </w:p>
+    <w:p>
+      <w:pPr>
+        <w:rPr>
+          <w:b/>
+          <w:bCs/>
+        </w:rPr>
+      </w:pPr>
+    </w:p>
+    <w:p>
+      <w:pPr>
+        <w:rPr>
+          <w:b/>
+          <w:bCs/>
+        </w:rPr>
+      </w:pPr>
     </w:p>
     <w:p>
       <w:r>
@@ -1586,7 +2081,6 @@
     </w:p>
     <w:p>
       <w:r>
-        <w:lastRenderedPageBreak/>
         <w:t>To improve accuracy, interpretability, and generalizability, several types of financial and contextual data could be incorporated into future versions of the model:</w:t>
       </w:r>
     </w:p>
@@ -1687,6 +2181,7 @@
     </w:p>
     <w:p>
       <w:r>
+        <w:lastRenderedPageBreak/>
         <w:t>By expanding the data landscape, future iterations of the model can more holistically represent fraud dynamics and move closer to replicating the decision-making frameworks used by forensic auditors.</w:t>
       </w:r>
     </w:p>
@@ -1758,7 +2253,15 @@
       </w:r>
       <w:r>
         <w:br/>
-        <w:t>The model's sensitivity to fraud improved significantly when prediction thresholds were calibrated, highlighting the risk of relying on default 0.5 cutoffs. This has implications for internal risk models that often treat outputs in binary terms.</w:t>
+        <w:t xml:space="preserve">The model's sensitivity to fraud improved significantly when prediction thresholds were calibrated, highlighting the risk of relying on default 0.5 cutoffs. This has implications for internal risk models that often treat </w:t>
+      </w:r>
+      <w:proofErr w:type="gramStart"/>
+      <w:r>
+        <w:t>outputs</w:t>
+      </w:r>
+      <w:proofErr w:type="gramEnd"/>
+      <w:r>
+        <w:t xml:space="preserve"> in binary terms.</w:t>
       </w:r>
     </w:p>
     <w:p>
@@ -1774,7 +2277,6 @@
           <w:b/>
           <w:bCs/>
         </w:rPr>
-        <w:lastRenderedPageBreak/>
         <w:t>CatBoost</w:t>
       </w:r>
       <w:proofErr w:type="spellEnd"/>
@@ -1829,6 +2331,7 @@
           <w:b/>
           <w:bCs/>
         </w:rPr>
+        <w:lastRenderedPageBreak/>
         <w:t>Prioritized Risk Reviews</w:t>
       </w:r>
       <w:r>
@@ -1913,8 +2416,13 @@
       </w:r>
     </w:p>
     <w:p>
-      <w:r>
-        <w:t>These use cases help bridge the gap between theoretical modeling and enterprise risk management, allowing businesses to detect, investigate, and ultimately prevent accounting fraud with greater precision.</w:t>
+      <w:proofErr w:type="gramStart"/>
+      <w:r>
+        <w:t>These use</w:t>
+      </w:r>
+      <w:proofErr w:type="gramEnd"/>
+      <w:r>
+        <w:t xml:space="preserve"> cases help bridge the gap between theoretical modeling and enterprise risk management, allowing businesses to detect, investigate, and ultimately prevent accounting fraud with greater precision.</w:t>
       </w:r>
     </w:p>
     <w:p>
@@ -1955,7 +2463,15 @@
       </w:r>
       <w:proofErr w:type="spellEnd"/>
       <w:r>
-        <w:t>, Power BI, or Tableau could allow users to explore fraud risk predictions interactively—adjusting inputs or thresholds to simulate various scenarios.</w:t>
+        <w:t xml:space="preserve">, Power BI, or Tableau could allow users to explore fraud risk predictions </w:t>
+      </w:r>
+      <w:proofErr w:type="gramStart"/>
+      <w:r>
+        <w:t>interactively—adjusting</w:t>
+      </w:r>
+      <w:proofErr w:type="gramEnd"/>
+      <w:r>
+        <w:t xml:space="preserve"> inputs or thresholds to simulate various scenarios.</w:t>
       </w:r>
     </w:p>
     <w:p>
@@ -1970,12 +2486,15 @@
           <w:b/>
           <w:bCs/>
         </w:rPr>
+        <w:t>Scheduled Reporting Pipelines</w:t>
+      </w:r>
+      <w:r>
+        <w:br/>
+        <w:t xml:space="preserve">Automating monthly or quarterly fraud reports, including flagged entities, evolving risk trends, </w:t>
+      </w:r>
+      <w:r>
         <w:lastRenderedPageBreak/>
-        <w:t>Scheduled Reporting Pipelines</w:t>
-      </w:r>
-      <w:r>
-        <w:br/>
-        <w:t>Automating monthly or quarterly fraud reports, including flagged entities, evolving risk trends, and top contributing features, ensures actionable insights are routinely surfaced to decision-makers.</w:t>
+        <w:t>and top contributing features, ensures actionable insights are routinely surfaced to decision-makers.</w:t>
       </w:r>
     </w:p>
     <w:p>
@@ -2013,7 +2532,18 @@
       </w:r>
       <w:r>
         <w:br/>
-        <w:t>Including feature importance charts, threshold tuning guides, and explanations of model logic (e.g., SHAP plots) can help demystify the underlying algorithms and build organizational trust.</w:t>
+      </w:r>
+      <w:r>
+        <w:t>F</w:t>
+      </w:r>
+      <w:r>
+        <w:t>eature importance charts, threshold tuning guides, and explanations of model logic (e.g., SHAP plots) can help demystify the underlying algorithms and build organizational trust</w:t>
+      </w:r>
+      <w:r>
+        <w:t xml:space="preserve">, </w:t>
+      </w:r>
+      <w:r>
+        <w:t>including per-record justifications that allow compliance teams to trace predictions back to the most influential financial indicators.</w:t>
       </w:r>
     </w:p>
     <w:p>
@@ -2126,7 +2656,16 @@
     </w:p>
     <w:p>
       <w:r>
-        <w:t>By embedding this model within audit and risk frameworks, businesses can shift from post-incident reviews to proactive fraud mitigation—creating a smarter, more resilient financial reporting environment.</w:t>
+        <w:lastRenderedPageBreak/>
+        <w:t xml:space="preserve">By embedding this model within audit and risk frameworks, businesses can shift from post-incident reviews to proactive fraud </w:t>
+      </w:r>
+      <w:proofErr w:type="gramStart"/>
+      <w:r>
+        <w:t>mitigation—</w:t>
+      </w:r>
+      <w:proofErr w:type="gramEnd"/>
+      <w:r>
+        <w:t>creating a smarter, more resilient financial reporting environment.</w:t>
       </w:r>
     </w:p>
     <w:p>
@@ -2158,10 +2697,9 @@
     </w:p>
     <w:p>
       <w:r>
-        <w:lastRenderedPageBreak/>
         <w:t>The primary dataset was sourced from the </w:t>
       </w:r>
-      <w:hyperlink r:id="rId11" w:history="1">
+      <w:hyperlink r:id="rId12" w:history="1">
         <w:r>
           <w:rPr>
             <w:rStyle w:val="Hyperlink"/>
@@ -2200,7 +2738,7 @@
       <w:r>
         <w:t>: </w:t>
       </w:r>
-      <w:hyperlink r:id="rId12" w:history="1">
+      <w:hyperlink r:id="rId13" w:history="1">
         <w:r>
           <w:rPr>
             <w:rStyle w:val="Hyperlink"/>
@@ -2226,7 +2764,7 @@
       <w:r>
         <w:t>: </w:t>
       </w:r>
-      <w:hyperlink r:id="rId13" w:history="1">
+      <w:hyperlink r:id="rId14" w:history="1">
         <w:r>
           <w:rPr>
             <w:rStyle w:val="Hyperlink"/>
@@ -2261,7 +2799,7 @@
       <w:r>
         <w:t xml:space="preserve"> </w:t>
       </w:r>
-      <w:hyperlink r:id="rId14" w:history="1">
+      <w:hyperlink r:id="rId15" w:history="1">
         <w:r>
           <w:rPr>
             <w:rStyle w:val="Hyperlink"/>
@@ -2880,6 +3418,155 @@
     </w:lvl>
   </w:abstractNum>
   <w:abstractNum w:abstractNumId="4" w15:restartNumberingAfterBreak="0">
+    <w:nsid w:val="2A677543"/>
+    <w:multiLevelType w:val="multilevel"/>
+    <w:tmpl w:val="DC46213E"/>
+    <w:lvl w:ilvl="0">
+      <w:start w:val="1"/>
+      <w:numFmt w:val="bullet"/>
+      <w:lvlText w:val=""/>
+      <w:lvlJc w:val="left"/>
+      <w:pPr>
+        <w:tabs>
+          <w:tab w:val="num" w:pos="720"/>
+        </w:tabs>
+        <w:ind w:left="720" w:hanging="360"/>
+      </w:pPr>
+      <w:rPr>
+        <w:rFonts w:ascii="Symbol" w:hAnsi="Symbol" w:hint="default"/>
+        <w:sz w:val="20"/>
+      </w:rPr>
+    </w:lvl>
+    <w:lvl w:ilvl="1" w:tentative="1">
+      <w:start w:val="1"/>
+      <w:numFmt w:val="bullet"/>
+      <w:lvlText w:val="o"/>
+      <w:lvlJc w:val="left"/>
+      <w:pPr>
+        <w:tabs>
+          <w:tab w:val="num" w:pos="1440"/>
+        </w:tabs>
+        <w:ind w:left="1440" w:hanging="360"/>
+      </w:pPr>
+      <w:rPr>
+        <w:rFonts w:ascii="Courier New" w:hAnsi="Courier New" w:hint="default"/>
+        <w:sz w:val="20"/>
+      </w:rPr>
+    </w:lvl>
+    <w:lvl w:ilvl="2" w:tentative="1">
+      <w:start w:val="1"/>
+      <w:numFmt w:val="bullet"/>
+      <w:lvlText w:val=""/>
+      <w:lvlJc w:val="left"/>
+      <w:pPr>
+        <w:tabs>
+          <w:tab w:val="num" w:pos="2160"/>
+        </w:tabs>
+        <w:ind w:left="2160" w:hanging="360"/>
+      </w:pPr>
+      <w:rPr>
+        <w:rFonts w:ascii="Wingdings" w:hAnsi="Wingdings" w:hint="default"/>
+        <w:sz w:val="20"/>
+      </w:rPr>
+    </w:lvl>
+    <w:lvl w:ilvl="3" w:tentative="1">
+      <w:start w:val="1"/>
+      <w:numFmt w:val="bullet"/>
+      <w:lvlText w:val=""/>
+      <w:lvlJc w:val="left"/>
+      <w:pPr>
+        <w:tabs>
+          <w:tab w:val="num" w:pos="2880"/>
+        </w:tabs>
+        <w:ind w:left="2880" w:hanging="360"/>
+      </w:pPr>
+      <w:rPr>
+        <w:rFonts w:ascii="Wingdings" w:hAnsi="Wingdings" w:hint="default"/>
+        <w:sz w:val="20"/>
+      </w:rPr>
+    </w:lvl>
+    <w:lvl w:ilvl="4" w:tentative="1">
+      <w:start w:val="1"/>
+      <w:numFmt w:val="bullet"/>
+      <w:lvlText w:val=""/>
+      <w:lvlJc w:val="left"/>
+      <w:pPr>
+        <w:tabs>
+          <w:tab w:val="num" w:pos="3600"/>
+        </w:tabs>
+        <w:ind w:left="3600" w:hanging="360"/>
+      </w:pPr>
+      <w:rPr>
+        <w:rFonts w:ascii="Wingdings" w:hAnsi="Wingdings" w:hint="default"/>
+        <w:sz w:val="20"/>
+      </w:rPr>
+    </w:lvl>
+    <w:lvl w:ilvl="5" w:tentative="1">
+      <w:start w:val="1"/>
+      <w:numFmt w:val="bullet"/>
+      <w:lvlText w:val=""/>
+      <w:lvlJc w:val="left"/>
+      <w:pPr>
+        <w:tabs>
+          <w:tab w:val="num" w:pos="4320"/>
+        </w:tabs>
+        <w:ind w:left="4320" w:hanging="360"/>
+      </w:pPr>
+      <w:rPr>
+        <w:rFonts w:ascii="Wingdings" w:hAnsi="Wingdings" w:hint="default"/>
+        <w:sz w:val="20"/>
+      </w:rPr>
+    </w:lvl>
+    <w:lvl w:ilvl="6" w:tentative="1">
+      <w:start w:val="1"/>
+      <w:numFmt w:val="bullet"/>
+      <w:lvlText w:val=""/>
+      <w:lvlJc w:val="left"/>
+      <w:pPr>
+        <w:tabs>
+          <w:tab w:val="num" w:pos="5040"/>
+        </w:tabs>
+        <w:ind w:left="5040" w:hanging="360"/>
+      </w:pPr>
+      <w:rPr>
+        <w:rFonts w:ascii="Wingdings" w:hAnsi="Wingdings" w:hint="default"/>
+        <w:sz w:val="20"/>
+      </w:rPr>
+    </w:lvl>
+    <w:lvl w:ilvl="7" w:tentative="1">
+      <w:start w:val="1"/>
+      <w:numFmt w:val="bullet"/>
+      <w:lvlText w:val=""/>
+      <w:lvlJc w:val="left"/>
+      <w:pPr>
+        <w:tabs>
+          <w:tab w:val="num" w:pos="5760"/>
+        </w:tabs>
+        <w:ind w:left="5760" w:hanging="360"/>
+      </w:pPr>
+      <w:rPr>
+        <w:rFonts w:ascii="Wingdings" w:hAnsi="Wingdings" w:hint="default"/>
+        <w:sz w:val="20"/>
+      </w:rPr>
+    </w:lvl>
+    <w:lvl w:ilvl="8" w:tentative="1">
+      <w:start w:val="1"/>
+      <w:numFmt w:val="bullet"/>
+      <w:lvlText w:val=""/>
+      <w:lvlJc w:val="left"/>
+      <w:pPr>
+        <w:tabs>
+          <w:tab w:val="num" w:pos="6480"/>
+        </w:tabs>
+        <w:ind w:left="6480" w:hanging="360"/>
+      </w:pPr>
+      <w:rPr>
+        <w:rFonts w:ascii="Wingdings" w:hAnsi="Wingdings" w:hint="default"/>
+        <w:sz w:val="20"/>
+      </w:rPr>
+    </w:lvl>
+  </w:abstractNum>
+  <w:abstractNum w:abstractNumId="5" w15:restartNumberingAfterBreak="0">
     <w:nsid w:val="32187361"/>
     <w:multiLevelType w:val="hybridMultilevel"/>
     <w:tmpl w:val="3036F5BC"/>
@@ -2965,7 +3652,7 @@
       </w:pPr>
     </w:lvl>
   </w:abstractNum>
-  <w:abstractNum w:abstractNumId="5" w15:restartNumberingAfterBreak="0">
+  <w:abstractNum w:abstractNumId="6" w15:restartNumberingAfterBreak="0">
     <w:nsid w:val="4E1535CA"/>
     <w:multiLevelType w:val="multilevel"/>
     <w:tmpl w:val="8488F982"/>
@@ -3114,7 +3801,7 @@
       </w:rPr>
     </w:lvl>
   </w:abstractNum>
-  <w:abstractNum w:abstractNumId="6" w15:restartNumberingAfterBreak="0">
+  <w:abstractNum w:abstractNumId="7" w15:restartNumberingAfterBreak="0">
     <w:nsid w:val="52C0550F"/>
     <w:multiLevelType w:val="multilevel"/>
     <w:tmpl w:val="B6EE49EC"/>
@@ -3263,7 +3950,7 @@
       </w:rPr>
     </w:lvl>
   </w:abstractNum>
-  <w:abstractNum w:abstractNumId="7" w15:restartNumberingAfterBreak="0">
+  <w:abstractNum w:abstractNumId="8" w15:restartNumberingAfterBreak="0">
     <w:nsid w:val="57A52005"/>
     <w:multiLevelType w:val="multilevel"/>
     <w:tmpl w:val="2D1E3E4C"/>
@@ -3412,7 +4099,156 @@
       </w:rPr>
     </w:lvl>
   </w:abstractNum>
-  <w:abstractNum w:abstractNumId="8" w15:restartNumberingAfterBreak="0">
+  <w:abstractNum w:abstractNumId="9" w15:restartNumberingAfterBreak="0">
+    <w:nsid w:val="5ACE62BD"/>
+    <w:multiLevelType w:val="multilevel"/>
+    <w:tmpl w:val="971CAD76"/>
+    <w:lvl w:ilvl="0">
+      <w:start w:val="1"/>
+      <w:numFmt w:val="bullet"/>
+      <w:lvlText w:val=""/>
+      <w:lvlJc w:val="left"/>
+      <w:pPr>
+        <w:tabs>
+          <w:tab w:val="num" w:pos="720"/>
+        </w:tabs>
+        <w:ind w:left="720" w:hanging="360"/>
+      </w:pPr>
+      <w:rPr>
+        <w:rFonts w:ascii="Symbol" w:hAnsi="Symbol" w:hint="default"/>
+        <w:sz w:val="20"/>
+      </w:rPr>
+    </w:lvl>
+    <w:lvl w:ilvl="1" w:tentative="1">
+      <w:start w:val="1"/>
+      <w:numFmt w:val="bullet"/>
+      <w:lvlText w:val="o"/>
+      <w:lvlJc w:val="left"/>
+      <w:pPr>
+        <w:tabs>
+          <w:tab w:val="num" w:pos="1440"/>
+        </w:tabs>
+        <w:ind w:left="1440" w:hanging="360"/>
+      </w:pPr>
+      <w:rPr>
+        <w:rFonts w:ascii="Courier New" w:hAnsi="Courier New" w:hint="default"/>
+        <w:sz w:val="20"/>
+      </w:rPr>
+    </w:lvl>
+    <w:lvl w:ilvl="2" w:tentative="1">
+      <w:start w:val="1"/>
+      <w:numFmt w:val="bullet"/>
+      <w:lvlText w:val=""/>
+      <w:lvlJc w:val="left"/>
+      <w:pPr>
+        <w:tabs>
+          <w:tab w:val="num" w:pos="2160"/>
+        </w:tabs>
+        <w:ind w:left="2160" w:hanging="360"/>
+      </w:pPr>
+      <w:rPr>
+        <w:rFonts w:ascii="Wingdings" w:hAnsi="Wingdings" w:hint="default"/>
+        <w:sz w:val="20"/>
+      </w:rPr>
+    </w:lvl>
+    <w:lvl w:ilvl="3" w:tentative="1">
+      <w:start w:val="1"/>
+      <w:numFmt w:val="bullet"/>
+      <w:lvlText w:val=""/>
+      <w:lvlJc w:val="left"/>
+      <w:pPr>
+        <w:tabs>
+          <w:tab w:val="num" w:pos="2880"/>
+        </w:tabs>
+        <w:ind w:left="2880" w:hanging="360"/>
+      </w:pPr>
+      <w:rPr>
+        <w:rFonts w:ascii="Wingdings" w:hAnsi="Wingdings" w:hint="default"/>
+        <w:sz w:val="20"/>
+      </w:rPr>
+    </w:lvl>
+    <w:lvl w:ilvl="4" w:tentative="1">
+      <w:start w:val="1"/>
+      <w:numFmt w:val="bullet"/>
+      <w:lvlText w:val=""/>
+      <w:lvlJc w:val="left"/>
+      <w:pPr>
+        <w:tabs>
+          <w:tab w:val="num" w:pos="3600"/>
+        </w:tabs>
+        <w:ind w:left="3600" w:hanging="360"/>
+      </w:pPr>
+      <w:rPr>
+        <w:rFonts w:ascii="Wingdings" w:hAnsi="Wingdings" w:hint="default"/>
+        <w:sz w:val="20"/>
+      </w:rPr>
+    </w:lvl>
+    <w:lvl w:ilvl="5" w:tentative="1">
+      <w:start w:val="1"/>
+      <w:numFmt w:val="bullet"/>
+      <w:lvlText w:val=""/>
+      <w:lvlJc w:val="left"/>
+      <w:pPr>
+        <w:tabs>
+          <w:tab w:val="num" w:pos="4320"/>
+        </w:tabs>
+        <w:ind w:left="4320" w:hanging="360"/>
+      </w:pPr>
+      <w:rPr>
+        <w:rFonts w:ascii="Wingdings" w:hAnsi="Wingdings" w:hint="default"/>
+        <w:sz w:val="20"/>
+      </w:rPr>
+    </w:lvl>
+    <w:lvl w:ilvl="6" w:tentative="1">
+      <w:start w:val="1"/>
+      <w:numFmt w:val="bullet"/>
+      <w:lvlText w:val=""/>
+      <w:lvlJc w:val="left"/>
+      <w:pPr>
+        <w:tabs>
+          <w:tab w:val="num" w:pos="5040"/>
+        </w:tabs>
+        <w:ind w:left="5040" w:hanging="360"/>
+      </w:pPr>
+      <w:rPr>
+        <w:rFonts w:ascii="Wingdings" w:hAnsi="Wingdings" w:hint="default"/>
+        <w:sz w:val="20"/>
+      </w:rPr>
+    </w:lvl>
+    <w:lvl w:ilvl="7" w:tentative="1">
+      <w:start w:val="1"/>
+      <w:numFmt w:val="bullet"/>
+      <w:lvlText w:val=""/>
+      <w:lvlJc w:val="left"/>
+      <w:pPr>
+        <w:tabs>
+          <w:tab w:val="num" w:pos="5760"/>
+        </w:tabs>
+        <w:ind w:left="5760" w:hanging="360"/>
+      </w:pPr>
+      <w:rPr>
+        <w:rFonts w:ascii="Wingdings" w:hAnsi="Wingdings" w:hint="default"/>
+        <w:sz w:val="20"/>
+      </w:rPr>
+    </w:lvl>
+    <w:lvl w:ilvl="8" w:tentative="1">
+      <w:start w:val="1"/>
+      <w:numFmt w:val="bullet"/>
+      <w:lvlText w:val=""/>
+      <w:lvlJc w:val="left"/>
+      <w:pPr>
+        <w:tabs>
+          <w:tab w:val="num" w:pos="6480"/>
+        </w:tabs>
+        <w:ind w:left="6480" w:hanging="360"/>
+      </w:pPr>
+      <w:rPr>
+        <w:rFonts w:ascii="Wingdings" w:hAnsi="Wingdings" w:hint="default"/>
+        <w:sz w:val="20"/>
+      </w:rPr>
+    </w:lvl>
+  </w:abstractNum>
+  <w:abstractNum w:abstractNumId="10" w15:restartNumberingAfterBreak="0">
     <w:nsid w:val="5B1F7CDE"/>
     <w:multiLevelType w:val="hybridMultilevel"/>
     <w:tmpl w:val="68ECA166"/>
@@ -3525,7 +4361,7 @@
       </w:rPr>
     </w:lvl>
   </w:abstractNum>
-  <w:abstractNum w:abstractNumId="9" w15:restartNumberingAfterBreak="0">
+  <w:abstractNum w:abstractNumId="11" w15:restartNumberingAfterBreak="0">
     <w:nsid w:val="615D6DEE"/>
     <w:multiLevelType w:val="multilevel"/>
     <w:tmpl w:val="09C2A8D6"/>
@@ -3674,7 +4510,7 @@
       </w:rPr>
     </w:lvl>
   </w:abstractNum>
-  <w:abstractNum w:abstractNumId="10" w15:restartNumberingAfterBreak="0">
+  <w:abstractNum w:abstractNumId="12" w15:restartNumberingAfterBreak="0">
     <w:nsid w:val="69D96B6E"/>
     <w:multiLevelType w:val="multilevel"/>
     <w:tmpl w:val="76AC43D8"/>
@@ -3823,7 +4659,7 @@
       </w:rPr>
     </w:lvl>
   </w:abstractNum>
-  <w:abstractNum w:abstractNumId="11" w15:restartNumberingAfterBreak="0">
+  <w:abstractNum w:abstractNumId="13" w15:restartNumberingAfterBreak="0">
     <w:nsid w:val="6C042C60"/>
     <w:multiLevelType w:val="multilevel"/>
     <w:tmpl w:val="36C0C25A"/>
@@ -3843,7 +4679,7 @@
         <w:sz w:val="20"/>
       </w:rPr>
     </w:lvl>
-    <w:lvl w:ilvl="1" w:tentative="1">
+    <w:lvl w:ilvl="1">
       <w:start w:val="1"/>
       <w:numFmt w:val="bullet"/>
       <w:lvlText w:val="o"/>
@@ -3972,7 +4808,7 @@
       </w:rPr>
     </w:lvl>
   </w:abstractNum>
-  <w:abstractNum w:abstractNumId="12" w15:restartNumberingAfterBreak="0">
+  <w:abstractNum w:abstractNumId="14" w15:restartNumberingAfterBreak="0">
     <w:nsid w:val="71D54FD8"/>
     <w:multiLevelType w:val="multilevel"/>
     <w:tmpl w:val="A5C87774"/>
@@ -4125,25 +4961,25 @@
     <w:abstractNumId w:val="1"/>
   </w:num>
   <w:num w:numId="2" w16cid:durableId="1904757513">
-    <w:abstractNumId w:val="8"/>
+    <w:abstractNumId w:val="10"/>
   </w:num>
   <w:num w:numId="3" w16cid:durableId="1400857656">
     <w:abstractNumId w:val="0"/>
   </w:num>
   <w:num w:numId="4" w16cid:durableId="1167791986">
-    <w:abstractNumId w:val="9"/>
+    <w:abstractNumId w:val="11"/>
   </w:num>
   <w:num w:numId="5" w16cid:durableId="389115902">
+    <w:abstractNumId w:val="14"/>
+  </w:num>
+  <w:num w:numId="6" w16cid:durableId="235168994">
     <w:abstractNumId w:val="12"/>
   </w:num>
-  <w:num w:numId="6" w16cid:durableId="235168994">
-    <w:abstractNumId w:val="10"/>
-  </w:num>
   <w:num w:numId="7" w16cid:durableId="552738861">
-    <w:abstractNumId w:val="7"/>
+    <w:abstractNumId w:val="8"/>
   </w:num>
   <w:num w:numId="8" w16cid:durableId="1182664740">
-    <w:abstractNumId w:val="11"/>
+    <w:abstractNumId w:val="13"/>
   </w:num>
   <w:num w:numId="9" w16cid:durableId="1332179819">
     <w:abstractNumId w:val="2"/>
@@ -4152,13 +4988,19 @@
     <w:abstractNumId w:val="3"/>
   </w:num>
   <w:num w:numId="11" w16cid:durableId="754010779">
+    <w:abstractNumId w:val="7"/>
+  </w:num>
+  <w:num w:numId="12" w16cid:durableId="1220941750">
     <w:abstractNumId w:val="6"/>
   </w:num>
-  <w:num w:numId="12" w16cid:durableId="1220941750">
+  <w:num w:numId="13" w16cid:durableId="1354695380">
     <w:abstractNumId w:val="5"/>
   </w:num>
-  <w:num w:numId="13" w16cid:durableId="1354695380">
+  <w:num w:numId="14" w16cid:durableId="1272125553">
     <w:abstractNumId w:val="4"/>
+  </w:num>
+  <w:num w:numId="15" w16cid:durableId="97675674">
+    <w:abstractNumId w:val="9"/>
   </w:num>
 </w:numbering>
 </file>

</xml_diff>